<commit_message>
Ajustar entrega ao escopo do enunciado
</commit_message>
<xml_diff>
--- a/docs/plano_testes.docx
+++ b/docs/plano_testes.docx
@@ -7,72 +7,12 @@
         <w:pStyle w:val="Title"/>
       </w:pPr>
       <w:r>
-        <w:t>Plano de testes do almoxarifado</w:t>
+        <w:t>Plano de testes de saída de produtos</w:t>
       </w:r>
     </w:p>
     <w:p>
       <w:r>
-        <w:t>Verificar as saídas de produtos e os controles de acesso do sistema. O roteiro contém 26 cenários, incluindo saídas acima, abaixo e iguais ao saldo disponível.</w:t>
-      </w:r>
-    </w:p>
-    <w:p>
-      <w:pPr>
-        <w:keepNext w:val="0"/>
-        <w:keepLines/>
-      </w:pPr>
-      <w:r>
-        <w:rPr>
-          <w:b/>
-        </w:rPr>
-        <w:t xml:space="preserve">Data </w:t>
-      </w:r>
-      <w:r>
-        <w:t>22/10/2026</w:t>
-      </w:r>
-    </w:p>
-    <w:p>
-      <w:pPr>
-        <w:keepNext w:val="0"/>
-        <w:keepLines/>
-      </w:pPr>
-      <w:r>
-        <w:rPr>
-          <w:b/>
-        </w:rPr>
-        <w:t xml:space="preserve">Escopo </w:t>
-      </w:r>
-      <w:r>
-        <w:t>Saídas, entradas, saldo, rastreabilidade, autenticação, perfis, cadastro e consulta de produtos.</w:t>
-      </w:r>
-    </w:p>
-    <w:p>
-      <w:pPr>
-        <w:keepNext w:val="0"/>
-        <w:keepLines/>
-      </w:pPr>
-      <w:r>
-        <w:rPr>
-          <w:b/>
-        </w:rPr>
-        <w:t xml:space="preserve">Fora do escopo </w:t>
-      </w:r>
-      <w:r>
-        <w:t>Carga em produção e serviços externos.</w:t>
-      </w:r>
-    </w:p>
-    <w:p>
-      <w:pPr>
-        <w:keepNext w:val="0"/>
-        <w:keepLines/>
-      </w:pPr>
-      <w:r>
-        <w:rPr>
-          <w:b/>
-        </w:rPr>
-        <w:t xml:space="preserve">Método </w:t>
-      </w:r>
-      <w:r>
-        <w:t>Testes funcionais e de segurança por HTTP, com conferência no MySQL. Valores limite e duas saídas concorrentes.</w:t>
+        <w:t>Verificar o bloqueio de saída sem saldo suficiente, a atualização automática do estoque e o registro da data, hora e responsável quando a saída for permitida.</w:t>
       </w:r>
     </w:p>
     <w:p>
@@ -87,7 +27,7 @@
         <w:t xml:space="preserve">Ambiente </w:t>
       </w:r>
       <w:r>
-        <w:t>Node.js 24, MySQL 8, API Express e dados fictícios. Cada execução cria um banco de teste separado do banco da aplicação.</w:t>
+        <w:t>API Node.js e MySQL. Os testes usam dados fictícios em um banco separado da aplicação.</w:t>
       </w:r>
     </w:p>
     <w:p>
@@ -99,10 +39,10 @@
         <w:rPr>
           <w:b/>
         </w:rPr>
-        <w:t xml:space="preserve">Critério de entrada </w:t>
+        <w:t xml:space="preserve">Pré condições </w:t>
       </w:r>
       <w:r>
-        <w:t>Dependências instaladas, MySQL acessível e permissão para criar um banco de teste novo. Administrador, operador e produtos fictícios preparados pelo script.</w:t>
+        <w:t>MySQL disponível, dependências instaladas, administrador e operador preparados e produto com saldo 10 para cada cenário.</w:t>
       </w:r>
     </w:p>
     <w:p>
@@ -114,48 +54,18 @@
         <w:rPr>
           <w:b/>
         </w:rPr>
-        <w:t xml:space="preserve">Critério de saída </w:t>
+        <w:t xml:space="preserve">Procedimento </w:t>
       </w:r>
       <w:r>
-        <w:t>Todos os cenários executados e aprovados; nenhuma falha aberta.</w:t>
+        <w:t>Executar npm test. Em cada cenário, enviar POST /movimentacoes com produto_id, tipo "saida" e a quantidade indicada, usando o token do operador. Conferir a resposta HTTP e os registros no MySQL.</w:t>
       </w:r>
     </w:p>
     <w:p>
       <w:pPr>
-        <w:keepNext w:val="0"/>
-        <w:keepLines/>
+        <w:pStyle w:val="Heading1"/>
       </w:pPr>
       <w:r>
-        <w:rPr>
-          <w:b/>
-        </w:rPr>
-        <w:t xml:space="preserve">Execução </w:t>
-      </w:r>
-      <w:r>
-        <w:t>Rodar npm test na raiz do projeto. O script prepara usuários e produtos, envia requisições HTTP e confere os registros no MySQL. A ordem dos cenários segue os números abaixo.</w:t>
-      </w:r>
-    </w:p>
-    <w:p>
-      <w:pPr>
-        <w:keepNext w:val="0"/>
-        <w:keepLines/>
-      </w:pPr>
-      <w:r>
-        <w:rPr>
-          <w:b/>
-        </w:rPr>
-        <w:t xml:space="preserve">Registro </w:t>
-      </w:r>
-      <w:r>
-        <w:t>O plano executável está em docs/casos.json. Cada cenário gera docs/testes/cenarioX.json com dados, respostas e conclusão. O resumo da execução fica em docs/testes/execucao.json.</w:t>
-      </w:r>
-    </w:p>
-    <w:p>
-      <w:pPr>
-        <w:pStyle w:val="Heading2"/>
-      </w:pPr>
-      <w:r>
-        <w:t>Cenário 1 Saída acima do saldo</w:t>
+        <w:t>Cenário 1 saída maior que o saldo</w:t>
       </w:r>
     </w:p>
     <w:p>
@@ -170,22 +80,7 @@
         <w:t xml:space="preserve">Dados </w:t>
       </w:r>
       <w:r>
-        <w:t>Saldo 10, saída 11, operador autenticado.</w:t>
-      </w:r>
-    </w:p>
-    <w:p>
-      <w:pPr>
-        <w:keepNext/>
-        <w:keepLines/>
-      </w:pPr>
-      <w:r>
-        <w:rPr>
-          <w:b/>
-        </w:rPr>
-        <w:t xml:space="preserve">Passos </w:t>
-      </w:r>
-      <w:r>
-        <w:t>Registrar saída e consultar produto e movimentações no banco.</w:t>
+        <w:t>Saldo inicial 10. Quantidade solicitada 11.</w:t>
       </w:r>
     </w:p>
     <w:p>
@@ -197,18 +92,18 @@
         <w:rPr>
           <w:b/>
         </w:rPr>
-        <w:t xml:space="preserve">Esperado </w:t>
+        <w:t xml:space="preserve">Resultado esperado </w:t>
       </w:r>
       <w:r>
-        <w:t>HTTP 400; mensagem informa disponível 10 e solicitado 11; saldo continua 10; nenhum registro de saída.</w:t>
+        <w:t>HTTP 400. Exibir "Saída não permitida: estoque insuficiente. Disponível: 10. Solicitado: 11." Manter saldo 10 e não registrar movimentação.</w:t>
       </w:r>
     </w:p>
     <w:p>
       <w:pPr>
-        <w:pStyle w:val="Heading2"/>
+        <w:pStyle w:val="Heading1"/>
       </w:pPr>
       <w:r>
-        <w:t>Cenário 2 Saída abaixo do saldo</w:t>
+        <w:t>Cenário 2 saída menor que o saldo</w:t>
       </w:r>
     </w:p>
     <w:p>
@@ -223,22 +118,7 @@
         <w:t xml:space="preserve">Dados </w:t>
       </w:r>
       <w:r>
-        <w:t>Saldo 10, saída 4, operador autenticado.</w:t>
-      </w:r>
-    </w:p>
-    <w:p>
-      <w:pPr>
-        <w:keepNext/>
-        <w:keepLines/>
-      </w:pPr>
-      <w:r>
-        <w:rPr>
-          <w:b/>
-        </w:rPr>
-        <w:t xml:space="preserve">Passos </w:t>
-      </w:r>
-      <w:r>
-        <w:t>Registrar saída e consultar produto e movimentação no banco.</w:t>
+        <w:t>Saldo inicial 10. Quantidade solicitada 4.</w:t>
       </w:r>
     </w:p>
     <w:p>
@@ -250,18 +130,18 @@
         <w:rPr>
           <w:b/>
         </w:rPr>
-        <w:t xml:space="preserve">Esperado </w:t>
+        <w:t xml:space="preserve">Resultado esperado </w:t>
       </w:r>
       <w:r>
-        <w:t>HTTP 201; saldo 6; registro com quantidade 4, data/hora atual e operador responsável.</w:t>
+        <w:t>HTTP 201. Atualizar saldo para 6 e registrar uma saída de 4 unidades com data, hora e usuário responsável.</w:t>
       </w:r>
     </w:p>
     <w:p>
       <w:pPr>
-        <w:pStyle w:val="Heading2"/>
+        <w:pStyle w:val="Heading1"/>
       </w:pPr>
       <w:r>
-        <w:t>Cenário 3 Saída igual ao saldo</w:t>
+        <w:t>Cenário 3 saída igual ao saldo</w:t>
       </w:r>
     </w:p>
     <w:p>
@@ -276,22 +156,7 @@
         <w:t xml:space="preserve">Dados </w:t>
       </w:r>
       <w:r>
-        <w:t>Saldo 10, saída 10, operador autenticado.</w:t>
-      </w:r>
-    </w:p>
-    <w:p>
-      <w:pPr>
-        <w:keepNext/>
-        <w:keepLines/>
-      </w:pPr>
-      <w:r>
-        <w:rPr>
-          <w:b/>
-        </w:rPr>
-        <w:t xml:space="preserve">Passos </w:t>
-      </w:r>
-      <w:r>
-        <w:t>Registrar saída e consultar o banco.</w:t>
+        <w:t>Saldo inicial 10. Quantidade solicitada 10.</w:t>
       </w:r>
     </w:p>
     <w:p>
@@ -303,48 +168,10 @@
         <w:rPr>
           <w:b/>
         </w:rPr>
-        <w:t xml:space="preserve">Esperado </w:t>
+        <w:t xml:space="preserve">Resultado esperado </w:t>
       </w:r>
       <w:r>
-        <w:t>HTTP 201; saldo zero; uma saída registrada.</w:t>
-      </w:r>
-    </w:p>
-    <w:p>
-      <w:pPr>
-        <w:pStyle w:val="Heading2"/>
-      </w:pPr>
-      <w:r>
-        <w:t>Cenário 4 Saída com estoque zerado</w:t>
-      </w:r>
-    </w:p>
-    <w:p>
-      <w:pPr>
-        <w:keepNext/>
-        <w:keepLines/>
-      </w:pPr>
-      <w:r>
-        <w:rPr>
-          <w:b/>
-        </w:rPr>
-        <w:t xml:space="preserve">Dados </w:t>
-      </w:r>
-      <w:r>
-        <w:t>Saldo zero, saída 1, operador autenticado.</w:t>
-      </w:r>
-    </w:p>
-    <w:p>
-      <w:pPr>
-        <w:keepNext/>
-        <w:keepLines/>
-      </w:pPr>
-      <w:r>
-        <w:rPr>
-          <w:b/>
-        </w:rPr>
-        <w:t xml:space="preserve">Passos </w:t>
-      </w:r>
-      <w:r>
-        <w:t>Registrar saída e consultar o banco.</w:t>
+        <w:t>HTTP 201. Atualizar saldo para zero e registrar uma saída de 10 unidades com data, hora e usuário responsável.</w:t>
       </w:r>
     </w:p>
     <w:p>
@@ -356,48 +183,10 @@
         <w:rPr>
           <w:b/>
         </w:rPr>
-        <w:t xml:space="preserve">Esperado </w:t>
+        <w:t xml:space="preserve">Evidências </w:t>
       </w:r>
       <w:r>
-        <w:t>HTTP 400; mensagem informa disponível zero e solicitado 1; saldo zero e nenhum registro.</w:t>
-      </w:r>
-    </w:p>
-    <w:p>
-      <w:pPr>
-        <w:pStyle w:val="Heading2"/>
-      </w:pPr>
-      <w:r>
-        <w:t>Cenário 5 Cadastro e proteção da senha</w:t>
-      </w:r>
-    </w:p>
-    <w:p>
-      <w:pPr>
-        <w:keepNext/>
-        <w:keepLines/>
-      </w:pPr>
-      <w:r>
-        <w:rPr>
-          <w:b/>
-        </w:rPr>
-        <w:t xml:space="preserve">Dados </w:t>
-      </w:r>
-      <w:r>
-        <w:t>Nome, email válido, senha de teste e tipo administrador no cadastro público.</w:t>
-      </w:r>
-    </w:p>
-    <w:p>
-      <w:pPr>
-        <w:keepNext/>
-        <w:keepLines/>
-      </w:pPr>
-      <w:r>
-        <w:rPr>
-          <w:b/>
-        </w:rPr>
-        <w:t xml:space="preserve">Passos </w:t>
-      </w:r>
-      <w:r>
-        <w:t>Cadastrar usuário e conferir o registro no banco.</w:t>
+        <w:t>docs/testes/cenario1.json, cenario2.json e cenario3.json. Cada arquivo deve registrar dados usados, resposta, saldo e movimentações obtidas.</w:t>
       </w:r>
     </w:p>
     <w:p>
@@ -409,1123 +198,10 @@
         <w:rPr>
           <w:b/>
         </w:rPr>
-        <w:t xml:space="preserve">Esperado </w:t>
+        <w:t xml:space="preserve">Critério de conclusão </w:t>
       </w:r>
       <w:r>
-        <w:t>HTTP 201; usuário criado como operador; senha armazenada com hash bcrypt; resposta não contém senha.</w:t>
-      </w:r>
-    </w:p>
-    <w:p>
-      <w:pPr>
-        <w:pStyle w:val="Heading2"/>
-      </w:pPr>
-      <w:r>
-        <w:t>Cenário 6 Login válido</w:t>
-      </w:r>
-    </w:p>
-    <w:p>
-      <w:pPr>
-        <w:keepNext/>
-        <w:keepLines/>
-      </w:pPr>
-      <w:r>
-        <w:rPr>
-          <w:b/>
-        </w:rPr>
-        <w:t xml:space="preserve">Dados </w:t>
-      </w:r>
-      <w:r>
-        <w:t>Email e senha corretos de operador.</w:t>
-      </w:r>
-    </w:p>
-    <w:p>
-      <w:pPr>
-        <w:keepNext/>
-        <w:keepLines/>
-      </w:pPr>
-      <w:r>
-        <w:rPr>
-          <w:b/>
-        </w:rPr>
-        <w:t xml:space="preserve">Passos </w:t>
-      </w:r>
-      <w:r>
-        <w:t>Fazer login e consultar /usuarios/me com o token recebido.</w:t>
-      </w:r>
-    </w:p>
-    <w:p>
-      <w:pPr>
-        <w:keepNext w:val="0"/>
-        <w:keepLines/>
-      </w:pPr>
-      <w:r>
-        <w:rPr>
-          <w:b/>
-        </w:rPr>
-        <w:t xml:space="preserve">Esperado </w:t>
-      </w:r>
-      <w:r>
-        <w:t>HTTP 200; JWT válido; identificação correta do operador; nenhuma senha na resposta.</w:t>
-      </w:r>
-    </w:p>
-    <w:p>
-      <w:pPr>
-        <w:pStyle w:val="Heading2"/>
-      </w:pPr>
-      <w:r>
-        <w:t>Cenário 7 Login com senha incorreta</w:t>
-      </w:r>
-    </w:p>
-    <w:p>
-      <w:pPr>
-        <w:keepNext/>
-        <w:keepLines/>
-      </w:pPr>
-      <w:r>
-        <w:rPr>
-          <w:b/>
-        </w:rPr>
-        <w:t xml:space="preserve">Dados </w:t>
-      </w:r>
-      <w:r>
-        <w:t>Email existente e senha errada.</w:t>
-      </w:r>
-    </w:p>
-    <w:p>
-      <w:pPr>
-        <w:keepNext/>
-        <w:keepLines/>
-      </w:pPr>
-      <w:r>
-        <w:rPr>
-          <w:b/>
-        </w:rPr>
-        <w:t xml:space="preserve">Passos </w:t>
-      </w:r>
-      <w:r>
-        <w:t>Tentar fazer login.</w:t>
-      </w:r>
-    </w:p>
-    <w:p>
-      <w:pPr>
-        <w:keepNext w:val="0"/>
-        <w:keepLines/>
-      </w:pPr>
-      <w:r>
-        <w:rPr>
-          <w:b/>
-        </w:rPr>
-        <w:t xml:space="preserve">Esperado </w:t>
-      </w:r>
-      <w:r>
-        <w:t>HTTP 401; mensagem clara; nenhum token.</w:t>
-      </w:r>
-    </w:p>
-    <w:p>
-      <w:pPr>
-        <w:pStyle w:val="Heading2"/>
-      </w:pPr>
-      <w:r>
-        <w:t>Cenário 8 Acesso sem autenticação</w:t>
-      </w:r>
-    </w:p>
-    <w:p>
-      <w:pPr>
-        <w:keepNext/>
-        <w:keepLines/>
-      </w:pPr>
-      <w:r>
-        <w:rPr>
-          <w:b/>
-        </w:rPr>
-        <w:t xml:space="preserve">Dados </w:t>
-      </w:r>
-      <w:r>
-        <w:t>Sem cabeçalho Authorization.</w:t>
-      </w:r>
-    </w:p>
-    <w:p>
-      <w:pPr>
-        <w:keepNext/>
-        <w:keepLines/>
-      </w:pPr>
-      <w:r>
-        <w:rPr>
-          <w:b/>
-        </w:rPr>
-        <w:t xml:space="preserve">Passos </w:t>
-      </w:r>
-      <w:r>
-        <w:t>Consultar produtos, usuários e movimentações e tentar cadastrar produto.</w:t>
-      </w:r>
-    </w:p>
-    <w:p>
-      <w:pPr>
-        <w:keepNext w:val="0"/>
-        <w:keepLines/>
-      </w:pPr>
-      <w:r>
-        <w:rPr>
-          <w:b/>
-        </w:rPr>
-        <w:t xml:space="preserve">Esperado </w:t>
-      </w:r>
-      <w:r>
-        <w:t>HTTP 401 em todas as rotas; nenhum produto inserido.</w:t>
-      </w:r>
-    </w:p>
-    <w:p>
-      <w:pPr>
-        <w:pStyle w:val="Heading2"/>
-      </w:pPr>
-      <w:r>
-        <w:t>Cenário 9 Token inválido ou expirado</w:t>
-      </w:r>
-    </w:p>
-    <w:p>
-      <w:pPr>
-        <w:keepNext/>
-        <w:keepLines/>
-      </w:pPr>
-      <w:r>
-        <w:rPr>
-          <w:b/>
-        </w:rPr>
-        <w:t xml:space="preserve">Dados </w:t>
-      </w:r>
-      <w:r>
-        <w:t>Token inválido e token assinado com expiração passada.</w:t>
-      </w:r>
-    </w:p>
-    <w:p>
-      <w:pPr>
-        <w:keepNext/>
-        <w:keepLines/>
-      </w:pPr>
-      <w:r>
-        <w:rPr>
-          <w:b/>
-        </w:rPr>
-        <w:t xml:space="preserve">Passos </w:t>
-      </w:r>
-      <w:r>
-        <w:t>Consultar produtos com cada token.</w:t>
-      </w:r>
-    </w:p>
-    <w:p>
-      <w:pPr>
-        <w:keepNext w:val="0"/>
-        <w:keepLines/>
-      </w:pPr>
-      <w:r>
-        <w:rPr>
-          <w:b/>
-        </w:rPr>
-        <w:t xml:space="preserve">Esperado </w:t>
-      </w:r>
-      <w:r>
-        <w:t>HTTP 401 para ambos.</w:t>
-      </w:r>
-    </w:p>
-    <w:p>
-      <w:pPr>
-        <w:pStyle w:val="Heading2"/>
-      </w:pPr>
-      <w:r>
-        <w:t>Cenário 10 Operador não pode excluir</w:t>
-      </w:r>
-    </w:p>
-    <w:p>
-      <w:pPr>
-        <w:keepNext/>
-        <w:keepLines/>
-      </w:pPr>
-      <w:r>
-        <w:rPr>
-          <w:b/>
-        </w:rPr>
-        <w:t xml:space="preserve">Dados </w:t>
-      </w:r>
-      <w:r>
-        <w:t>Produto existente e token de operador.</w:t>
-      </w:r>
-    </w:p>
-    <w:p>
-      <w:pPr>
-        <w:keepNext/>
-        <w:keepLines/>
-      </w:pPr>
-      <w:r>
-        <w:rPr>
-          <w:b/>
-        </w:rPr>
-        <w:t xml:space="preserve">Passos </w:t>
-      </w:r>
-      <w:r>
-        <w:t>Tentar excluir produto.</w:t>
-      </w:r>
-    </w:p>
-    <w:p>
-      <w:pPr>
-        <w:keepNext w:val="0"/>
-        <w:keepLines/>
-      </w:pPr>
-      <w:r>
-        <w:rPr>
-          <w:b/>
-        </w:rPr>
-        <w:t xml:space="preserve">Esperado </w:t>
-      </w:r>
-      <w:r>
-        <w:t>HTTP 403; produto continua disponível.</w:t>
-      </w:r>
-    </w:p>
-    <w:p>
-      <w:pPr>
-        <w:pStyle w:val="Heading2"/>
-      </w:pPr>
-      <w:r>
-        <w:t>Cenário 11 Administrador exclui preservando histórico</w:t>
-      </w:r>
-    </w:p>
-    <w:p>
-      <w:pPr>
-        <w:keepNext/>
-        <w:keepLines/>
-      </w:pPr>
-      <w:r>
-        <w:rPr>
-          <w:b/>
-        </w:rPr>
-        <w:t xml:space="preserve">Dados </w:t>
-      </w:r>
-      <w:r>
-        <w:t>Produto com uma saída registrada e token de administrador.</w:t>
-      </w:r>
-    </w:p>
-    <w:p>
-      <w:pPr>
-        <w:keepNext/>
-        <w:keepLines/>
-      </w:pPr>
-      <w:r>
-        <w:rPr>
-          <w:b/>
-        </w:rPr>
-        <w:t xml:space="preserve">Passos </w:t>
-      </w:r>
-      <w:r>
-        <w:t>Excluir produto, consultar o banco e listar movimentações.</w:t>
-      </w:r>
-    </w:p>
-    <w:p>
-      <w:pPr>
-        <w:keepNext w:val="0"/>
-        <w:keepLines/>
-      </w:pPr>
-      <w:r>
-        <w:rPr>
-          <w:b/>
-        </w:rPr>
-        <w:t xml:space="preserve">Esperado </w:t>
-      </w:r>
-      <w:r>
-        <w:t>HTTP 200; produto indisponível na lista; histórico conserva produto, responsável e data.</w:t>
-      </w:r>
-    </w:p>
-    <w:p>
-      <w:pPr>
-        <w:pStyle w:val="Heading2"/>
-      </w:pPr>
-      <w:r>
-        <w:t>Cenário 12 Operador insere e atualiza produto</w:t>
-      </w:r>
-    </w:p>
-    <w:p>
-      <w:pPr>
-        <w:keepNext/>
-        <w:keepLines/>
-      </w:pPr>
-      <w:r>
-        <w:rPr>
-          <w:b/>
-        </w:rPr>
-        <w:t xml:space="preserve">Dados </w:t>
-      </w:r>
-      <w:r>
-        <w:t>Produto novo com saldo 10 e token de operador.</w:t>
-      </w:r>
-    </w:p>
-    <w:p>
-      <w:pPr>
-        <w:keepNext/>
-        <w:keepLines/>
-      </w:pPr>
-      <w:r>
-        <w:rPr>
-          <w:b/>
-        </w:rPr>
-        <w:t xml:space="preserve">Passos </w:t>
-      </w:r>
-      <w:r>
-        <w:t>Cadastrar, alterar nome e descrição e tentar alterar o saldo diretamente.</w:t>
-      </w:r>
-    </w:p>
-    <w:p>
-      <w:pPr>
-        <w:keepNext w:val="0"/>
-        <w:keepLines/>
-      </w:pPr>
-      <w:r>
-        <w:rPr>
-          <w:b/>
-        </w:rPr>
-        <w:t xml:space="preserve">Esperado </w:t>
-      </w:r>
-      <w:r>
-        <w:t>Cadastro 201; atualização 200; saldo direto recusado com 400 e mantido em 10.</w:t>
-      </w:r>
-    </w:p>
-    <w:p>
-      <w:pPr>
-        <w:pStyle w:val="Heading2"/>
-      </w:pPr>
-      <w:r>
-        <w:t>Cenário 13 Gestão de usuários pelo administrador</w:t>
-      </w:r>
-    </w:p>
-    <w:p>
-      <w:pPr>
-        <w:keepNext/>
-        <w:keepLines/>
-      </w:pPr>
-      <w:r>
-        <w:rPr>
-          <w:b/>
-        </w:rPr>
-        <w:t xml:space="preserve">Dados </w:t>
-      </w:r>
-      <w:r>
-        <w:t>Usuário fictício sem movimentações.</w:t>
-      </w:r>
-    </w:p>
-    <w:p>
-      <w:pPr>
-        <w:keepNext/>
-        <w:keepLines/>
-      </w:pPr>
-      <w:r>
-        <w:rPr>
-          <w:b/>
-        </w:rPr>
-        <w:t xml:space="preserve">Passos </w:t>
-      </w:r>
-      <w:r>
-        <w:t>Administrador lista, altera perfil e exclui o usuário; operador tenta listar usuários.</w:t>
-      </w:r>
-    </w:p>
-    <w:p>
-      <w:pPr>
-        <w:keepNext w:val="0"/>
-        <w:keepLines/>
-      </w:pPr>
-      <w:r>
-        <w:rPr>
-          <w:b/>
-        </w:rPr>
-        <w:t xml:space="preserve">Esperado </w:t>
-      </w:r>
-      <w:r>
-        <w:t>Administrador recebe 200; operador recebe 403; usuário excluído perde acesso com token anterior.</w:t>
-      </w:r>
-    </w:p>
-    <w:p>
-      <w:pPr>
-        <w:pStyle w:val="Heading2"/>
-      </w:pPr>
-      <w:r>
-        <w:t>Cenário 14 Operador não eleva privilégios</w:t>
-      </w:r>
-    </w:p>
-    <w:p>
-      <w:pPr>
-        <w:keepNext/>
-        <w:keepLines/>
-      </w:pPr>
-      <w:r>
-        <w:rPr>
-          <w:b/>
-        </w:rPr>
-        <w:t xml:space="preserve">Dados </w:t>
-      </w:r>
-      <w:r>
-        <w:t>Operador tenta se tornar administrador e alterar outro usuário.</w:t>
-      </w:r>
-    </w:p>
-    <w:p>
-      <w:pPr>
-        <w:keepNext/>
-        <w:keepLines/>
-      </w:pPr>
-      <w:r>
-        <w:rPr>
-          <w:b/>
-        </w:rPr>
-        <w:t xml:space="preserve">Passos </w:t>
-      </w:r>
-      <w:r>
-        <w:t>Enviar PUT /usuarios/:id com perfil administrador e alteração de outro usuário.</w:t>
-      </w:r>
-    </w:p>
-    <w:p>
-      <w:pPr>
-        <w:keepNext w:val="0"/>
-        <w:keepLines/>
-      </w:pPr>
-      <w:r>
-        <w:rPr>
-          <w:b/>
-        </w:rPr>
-        <w:t xml:space="preserve">Esperado </w:t>
-      </w:r>
-      <w:r>
-        <w:t>HTTP 403; perfil e usuário alheio permanecem iguais.</w:t>
-      </w:r>
-    </w:p>
-    <w:p>
-      <w:pPr>
-        <w:pStyle w:val="Heading2"/>
-      </w:pPr>
-      <w:r>
-        <w:t>Cenário 15 Quantidade zero</w:t>
-      </w:r>
-    </w:p>
-    <w:p>
-      <w:pPr>
-        <w:keepNext/>
-        <w:keepLines/>
-      </w:pPr>
-      <w:r>
-        <w:rPr>
-          <w:b/>
-        </w:rPr>
-        <w:t xml:space="preserve">Dados </w:t>
-      </w:r>
-      <w:r>
-        <w:t>Saldo 10, saída de quantidade zero.</w:t>
-      </w:r>
-    </w:p>
-    <w:p>
-      <w:pPr>
-        <w:keepNext/>
-        <w:keepLines/>
-      </w:pPr>
-      <w:r>
-        <w:rPr>
-          <w:b/>
-        </w:rPr>
-        <w:t xml:space="preserve">Passos </w:t>
-      </w:r>
-      <w:r>
-        <w:t>Registrar saída e consultar o banco.</w:t>
-      </w:r>
-    </w:p>
-    <w:p>
-      <w:pPr>
-        <w:keepNext w:val="0"/>
-        <w:keepLines/>
-      </w:pPr>
-      <w:r>
-        <w:rPr>
-          <w:b/>
-        </w:rPr>
-        <w:t xml:space="preserve">Esperado </w:t>
-      </w:r>
-      <w:r>
-        <w:t>HTTP 400; saldo 10; nenhum registro.</w:t>
-      </w:r>
-    </w:p>
-    <w:p>
-      <w:pPr>
-        <w:pStyle w:val="Heading2"/>
-      </w:pPr>
-      <w:r>
-        <w:t>Cenário 16 Quantidade negativa</w:t>
-      </w:r>
-    </w:p>
-    <w:p>
-      <w:pPr>
-        <w:keepNext/>
-        <w:keepLines/>
-      </w:pPr>
-      <w:r>
-        <w:rPr>
-          <w:b/>
-        </w:rPr>
-        <w:t xml:space="preserve">Dados </w:t>
-      </w:r>
-      <w:r>
-        <w:t>Saldo 10, saída de quantidade -1.</w:t>
-      </w:r>
-    </w:p>
-    <w:p>
-      <w:pPr>
-        <w:keepNext/>
-        <w:keepLines/>
-      </w:pPr>
-      <w:r>
-        <w:rPr>
-          <w:b/>
-        </w:rPr>
-        <w:t xml:space="preserve">Passos </w:t>
-      </w:r>
-      <w:r>
-        <w:t>Registrar saída e consultar o banco.</w:t>
-      </w:r>
-    </w:p>
-    <w:p>
-      <w:pPr>
-        <w:keepNext w:val="0"/>
-        <w:keepLines/>
-      </w:pPr>
-      <w:r>
-        <w:rPr>
-          <w:b/>
-        </w:rPr>
-        <w:t xml:space="preserve">Esperado </w:t>
-      </w:r>
-      <w:r>
-        <w:t>HTTP 400; saldo 10; nenhum registro.</w:t>
-      </w:r>
-    </w:p>
-    <w:p>
-      <w:pPr>
-        <w:pStyle w:val="Heading2"/>
-      </w:pPr>
-      <w:r>
-        <w:t>Cenário 17 Quantidade fracionada</w:t>
-      </w:r>
-    </w:p>
-    <w:p>
-      <w:pPr>
-        <w:keepNext/>
-        <w:keepLines/>
-      </w:pPr>
-      <w:r>
-        <w:rPr>
-          <w:b/>
-        </w:rPr>
-        <w:t xml:space="preserve">Dados </w:t>
-      </w:r>
-      <w:r>
-        <w:t>Saldo 10, saída de quantidade 1,5.</w:t>
-      </w:r>
-    </w:p>
-    <w:p>
-      <w:pPr>
-        <w:keepNext/>
-        <w:keepLines/>
-      </w:pPr>
-      <w:r>
-        <w:rPr>
-          <w:b/>
-        </w:rPr>
-        <w:t xml:space="preserve">Passos </w:t>
-      </w:r>
-      <w:r>
-        <w:t>Registrar saída e consultar o banco.</w:t>
-      </w:r>
-    </w:p>
-    <w:p>
-      <w:pPr>
-        <w:keepNext w:val="0"/>
-        <w:keepLines/>
-      </w:pPr>
-      <w:r>
-        <w:rPr>
-          <w:b/>
-        </w:rPr>
-        <w:t xml:space="preserve">Esperado </w:t>
-      </w:r>
-      <w:r>
-        <w:t>HTTP 400; saldo 10; nenhum registro.</w:t>
-      </w:r>
-    </w:p>
-    <w:p>
-      <w:pPr>
-        <w:pStyle w:val="Heading2"/>
-      </w:pPr>
-      <w:r>
-        <w:t>Cenário 18 Entrada atualiza o saldo</w:t>
-      </w:r>
-    </w:p>
-    <w:p>
-      <w:pPr>
-        <w:keepNext/>
-        <w:keepLines/>
-      </w:pPr>
-      <w:r>
-        <w:rPr>
-          <w:b/>
-        </w:rPr>
-        <w:t xml:space="preserve">Dados </w:t>
-      </w:r>
-      <w:r>
-        <w:t>Saldo 10, entrada de 3.</w:t>
-      </w:r>
-    </w:p>
-    <w:p>
-      <w:pPr>
-        <w:keepNext/>
-        <w:keepLines/>
-      </w:pPr>
-      <w:r>
-        <w:rPr>
-          <w:b/>
-        </w:rPr>
-        <w:t xml:space="preserve">Passos </w:t>
-      </w:r>
-      <w:r>
-        <w:t>Registrar entrada e consultar o banco.</w:t>
-      </w:r>
-    </w:p>
-    <w:p>
-      <w:pPr>
-        <w:keepNext w:val="0"/>
-        <w:keepLines/>
-      </w:pPr>
-      <w:r>
-        <w:rPr>
-          <w:b/>
-        </w:rPr>
-        <w:t xml:space="preserve">Esperado </w:t>
-      </w:r>
-      <w:r>
-        <w:t>HTTP 201; saldo 13; entrada com data e responsável.</w:t>
-      </w:r>
-    </w:p>
-    <w:p>
-      <w:pPr>
-        <w:pStyle w:val="Heading2"/>
-      </w:pPr>
-      <w:r>
-        <w:t>Cenário 19 Tipo de movimentação inválido</w:t>
-      </w:r>
-    </w:p>
-    <w:p>
-      <w:pPr>
-        <w:keepNext/>
-        <w:keepLines/>
-      </w:pPr>
-      <w:r>
-        <w:rPr>
-          <w:b/>
-        </w:rPr>
-        <w:t xml:space="preserve">Dados </w:t>
-      </w:r>
-      <w:r>
-        <w:t>Saldo 10, tipo ajuste e quantidade 1.</w:t>
-      </w:r>
-    </w:p>
-    <w:p>
-      <w:pPr>
-        <w:keepNext/>
-        <w:keepLines/>
-      </w:pPr>
-      <w:r>
-        <w:rPr>
-          <w:b/>
-        </w:rPr>
-        <w:t xml:space="preserve">Passos </w:t>
-      </w:r>
-      <w:r>
-        <w:t>Tentar registrar movimentação.</w:t>
-      </w:r>
-    </w:p>
-    <w:p>
-      <w:pPr>
-        <w:keepNext w:val="0"/>
-        <w:keepLines/>
-      </w:pPr>
-      <w:r>
-        <w:rPr>
-          <w:b/>
-        </w:rPr>
-        <w:t xml:space="preserve">Esperado </w:t>
-      </w:r>
-      <w:r>
-        <w:t>HTTP 400; saldo e histórico inalterados.</w:t>
-      </w:r>
-    </w:p>
-    <w:p>
-      <w:pPr>
-        <w:pStyle w:val="Heading2"/>
-      </w:pPr>
-      <w:r>
-        <w:t>Cenário 20 Produto inexistente</w:t>
-      </w:r>
-    </w:p>
-    <w:p>
-      <w:pPr>
-        <w:keepNext/>
-        <w:keepLines/>
-      </w:pPr>
-      <w:r>
-        <w:rPr>
-          <w:b/>
-        </w:rPr>
-        <w:t xml:space="preserve">Dados </w:t>
-      </w:r>
-      <w:r>
-        <w:t>ID 2147483647, saída de 1.</w:t>
-      </w:r>
-    </w:p>
-    <w:p>
-      <w:pPr>
-        <w:keepNext/>
-        <w:keepLines/>
-      </w:pPr>
-      <w:r>
-        <w:rPr>
-          <w:b/>
-        </w:rPr>
-        <w:t xml:space="preserve">Passos </w:t>
-      </w:r>
-      <w:r>
-        <w:t>Tentar registrar saída.</w:t>
-      </w:r>
-    </w:p>
-    <w:p>
-      <w:pPr>
-        <w:keepNext w:val="0"/>
-        <w:keepLines/>
-      </w:pPr>
-      <w:r>
-        <w:rPr>
-          <w:b/>
-        </w:rPr>
-        <w:t xml:space="preserve">Esperado </w:t>
-      </w:r>
-      <w:r>
-        <w:t>HTTP 404; nenhum registro criado.</w:t>
-      </w:r>
-    </w:p>
-    <w:p>
-      <w:pPr>
-        <w:pStyle w:val="Heading2"/>
-      </w:pPr>
-      <w:r>
-        <w:t>Cenário 21 Paginação</w:t>
-      </w:r>
-    </w:p>
-    <w:p>
-      <w:pPr>
-        <w:keepNext/>
-        <w:keepLines/>
-      </w:pPr>
-      <w:r>
-        <w:rPr>
-          <w:b/>
-        </w:rPr>
-        <w:t xml:space="preserve">Dados </w:t>
-      </w:r>
-      <w:r>
-        <w:t>Três produtos com mesmo prefixo; limite 2.</w:t>
-      </w:r>
-    </w:p>
-    <w:p>
-      <w:pPr>
-        <w:keepNext/>
-        <w:keepLines/>
-      </w:pPr>
-      <w:r>
-        <w:rPr>
-          <w:b/>
-        </w:rPr>
-        <w:t xml:space="preserve">Passos </w:t>
-      </w:r>
-      <w:r>
-        <w:t>Consultar páginas 1 e 2.</w:t>
-      </w:r>
-    </w:p>
-    <w:p>
-      <w:pPr>
-        <w:keepNext w:val="0"/>
-        <w:keepLines/>
-      </w:pPr>
-      <w:r>
-        <w:rPr>
-          <w:b/>
-        </w:rPr>
-        <w:t xml:space="preserve">Esperado </w:t>
-      </w:r>
-      <w:r>
-        <w:t>HTTP 200; primeira página com dois produtos e segunda com um; sem repetição.</w:t>
-      </w:r>
-    </w:p>
-    <w:p>
-      <w:pPr>
-        <w:pStyle w:val="Heading2"/>
-      </w:pPr>
-      <w:r>
-        <w:t>Cenário 22 Filtro por nome</w:t>
-      </w:r>
-    </w:p>
-    <w:p>
-      <w:pPr>
-        <w:keepNext/>
-        <w:keepLines/>
-      </w:pPr>
-      <w:r>
-        <w:rPr>
-          <w:b/>
-        </w:rPr>
-        <w:t xml:space="preserve">Dados </w:t>
-      </w:r>
-      <w:r>
-        <w:t>Produtos Sabão e Detergente com prefixo exclusivo.</w:t>
-      </w:r>
-    </w:p>
-    <w:p>
-      <w:pPr>
-        <w:keepNext/>
-        <w:keepLines/>
-      </w:pPr>
-      <w:r>
-        <w:rPr>
-          <w:b/>
-        </w:rPr>
-        <w:t xml:space="preserve">Passos </w:t>
-      </w:r>
-      <w:r>
-        <w:t>Consultar nome contendo Sabão.</w:t>
-      </w:r>
-    </w:p>
-    <w:p>
-      <w:pPr>
-        <w:keepNext w:val="0"/>
-        <w:keepLines/>
-      </w:pPr>
-      <w:r>
-        <w:rPr>
-          <w:b/>
-        </w:rPr>
-        <w:t xml:space="preserve">Esperado </w:t>
-      </w:r>
-      <w:r>
-        <w:t>HTTP 200; somente o produto correspondente.</w:t>
-      </w:r>
-    </w:p>
-    <w:p>
-      <w:pPr>
-        <w:pStyle w:val="Heading2"/>
-      </w:pPr>
-      <w:r>
-        <w:t>Cenário 23 Filtro por data</w:t>
-      </w:r>
-    </w:p>
-    <w:p>
-      <w:pPr>
-        <w:keepNext/>
-        <w:keepLines/>
-      </w:pPr>
-      <w:r>
-        <w:rPr>
-          <w:b/>
-        </w:rPr>
-        <w:t xml:space="preserve">Dados </w:t>
-      </w:r>
-      <w:r>
-        <w:t>Dois produtos: cadastro em 2020 e em 2026; filtro data=2026-01-01.</w:t>
-      </w:r>
-    </w:p>
-    <w:p>
-      <w:pPr>
-        <w:keepNext/>
-        <w:keepLines/>
-      </w:pPr>
-      <w:r>
-        <w:rPr>
-          <w:b/>
-        </w:rPr>
-        <w:t xml:space="preserve">Passos </w:t>
-      </w:r>
-      <w:r>
-        <w:t>Consultar pelo prefixo e pela data.</w:t>
-      </w:r>
-    </w:p>
-    <w:p>
-      <w:pPr>
-        <w:keepNext w:val="0"/>
-        <w:keepLines/>
-      </w:pPr>
-      <w:r>
-        <w:rPr>
-          <w:b/>
-        </w:rPr>
-        <w:t xml:space="preserve">Esperado </w:t>
-      </w:r>
-      <w:r>
-        <w:t>HTTP 200; apenas o produto de 2026.</w:t>
-      </w:r>
-    </w:p>
-    <w:p>
-      <w:pPr>
-        <w:pStyle w:val="Heading2"/>
-      </w:pPr>
-      <w:r>
-        <w:t>Cenário 24 Duas saídas concorrentes</w:t>
-      </w:r>
-    </w:p>
-    <w:p>
-      <w:pPr>
-        <w:keepNext/>
-        <w:keepLines/>
-      </w:pPr>
-      <w:r>
-        <w:rPr>
-          <w:b/>
-        </w:rPr>
-        <w:t xml:space="preserve">Dados </w:t>
-      </w:r>
-      <w:r>
-        <w:t>Saldo 10; duas saídas simultâneas de 7.</w:t>
-      </w:r>
-    </w:p>
-    <w:p>
-      <w:pPr>
-        <w:keepNext/>
-        <w:keepLines/>
-      </w:pPr>
-      <w:r>
-        <w:rPr>
-          <w:b/>
-        </w:rPr>
-        <w:t xml:space="preserve">Passos </w:t>
-      </w:r>
-      <w:r>
-        <w:t>Enviar ambas ao mesmo tempo e consultar o banco.</w:t>
-      </w:r>
-    </w:p>
-    <w:p>
-      <w:pPr>
-        <w:keepNext w:val="0"/>
-        <w:keepLines/>
-      </w:pPr>
-      <w:r>
-        <w:rPr>
-          <w:b/>
-        </w:rPr>
-        <w:t xml:space="preserve">Esperado </w:t>
-      </w:r>
-      <w:r>
-        <w:t>Uma resposta 201 e uma 400; saldo 3; exatamente uma movimentação.</w:t>
-      </w:r>
-    </w:p>
-    <w:p>
-      <w:pPr>
-        <w:pStyle w:val="Heading2"/>
-      </w:pPr>
-      <w:r>
-        <w:t>Cenário 25 Responsável definido pelo token</w:t>
-      </w:r>
-    </w:p>
-    <w:p>
-      <w:pPr>
-        <w:keepNext/>
-        <w:keepLines/>
-      </w:pPr>
-      <w:r>
-        <w:rPr>
-          <w:b/>
-        </w:rPr>
-        <w:t xml:space="preserve">Dados </w:t>
-      </w:r>
-      <w:r>
-        <w:t>Operador autenticado envia usuario_id de administrador em saída de 1.</w:t>
-      </w:r>
-    </w:p>
-    <w:p>
-      <w:pPr>
-        <w:keepNext/>
-        <w:keepLines/>
-      </w:pPr>
-      <w:r>
-        <w:rPr>
-          <w:b/>
-        </w:rPr>
-        <w:t xml:space="preserve">Passos </w:t>
-      </w:r>
-      <w:r>
-        <w:t>Registrar saída e consultar a movimentação.</w:t>
-      </w:r>
-    </w:p>
-    <w:p>
-      <w:pPr>
-        <w:keepNext w:val="0"/>
-        <w:keepLines/>
-      </w:pPr>
-      <w:r>
-        <w:rPr>
-          <w:b/>
-        </w:rPr>
-        <w:t xml:space="preserve">Esperado </w:t>
-      </w:r>
-      <w:r>
-        <w:t>HTTP 201; responsável salvo é o operador do token.</w:t>
-      </w:r>
-    </w:p>
-    <w:p>
-      <w:pPr>
-        <w:pStyle w:val="Heading2"/>
-      </w:pPr>
-      <w:r>
-        <w:t>Cenário 26 Histórico e campos sensíveis</w:t>
-      </w:r>
-    </w:p>
-    <w:p>
-      <w:pPr>
-        <w:keepNext/>
-        <w:keepLines/>
-      </w:pPr>
-      <w:r>
-        <w:rPr>
-          <w:b/>
-        </w:rPr>
-        <w:t xml:space="preserve">Dados </w:t>
-      </w:r>
-      <w:r>
-        <w:t>Movimentação existente, operador autenticado.</w:t>
-      </w:r>
-    </w:p>
-    <w:p>
-      <w:pPr>
-        <w:keepNext/>
-        <w:keepLines/>
-      </w:pPr>
-      <w:r>
-        <w:rPr>
-          <w:b/>
-        </w:rPr>
-        <w:t xml:space="preserve">Passos </w:t>
-      </w:r>
-      <w:r>
-        <w:t>Consultar histórico e conferir campos retornados.</w:t>
-      </w:r>
-    </w:p>
-    <w:p>
-      <w:pPr>
-        <w:keepNext w:val="0"/>
-        <w:keepLines/>
-      </w:pPr>
-      <w:r>
-        <w:rPr>
-          <w:b/>
-        </w:rPr>
-        <w:t xml:space="preserve">Esperado </w:t>
-      </w:r>
-      <w:r>
-        <w:t>HTTP 200; produto, usuário, quantidade, tipo e data presentes; nenhuma senha ou token no histórico.</w:t>
+        <w:t>Os três cenários devem apresentar o resultado esperado. Documentar dados usados, saída obtida e conclusão em resultados.docx na raiz do projeto.</w:t>
       </w:r>
     </w:p>
     <w:sectPr>
@@ -1902,12 +578,12 @@
     <w:qFormat/>
     <w:rsid w:val="00FC693F"/>
     <w:pPr>
-      <w:spacing w:after="100" w:line="252" w:lineRule="auto"/>
+      <w:spacing w:after="120" w:line="252" w:lineRule="auto"/>
     </w:pPr>
     <w:rPr>
       <w:rFonts w:ascii="Arial" w:hAnsi="Arial"/>
       <w:color w:val="000000"/>
-      <w:sz w:val="21"/>
+      <w:sz w:val="22"/>
     </w:rPr>
   </w:style>
   <w:style w:type="paragraph" w:styleId="Header">
@@ -1989,15 +665,15 @@
     <w:pPr>
       <w:keepNext/>
       <w:keepLines/>
-      <w:spacing w:before="180" w:after="80"/>
+      <w:spacing w:before="200" w:after="0"/>
       <w:outlineLvl w:val="1"/>
     </w:pPr>
     <w:rPr>
-      <w:rFonts w:asciiTheme="majorHAnsi" w:eastAsiaTheme="majorEastAsia" w:hAnsiTheme="majorHAnsi" w:cstheme="majorBidi" w:ascii="Arial" w:hAnsi="Arial"/>
+      <w:rFonts w:asciiTheme="majorHAnsi" w:eastAsiaTheme="majorEastAsia" w:hAnsiTheme="majorHAnsi" w:cstheme="majorBidi"/>
       <w:b/>
       <w:bCs/>
-      <w:color w:val="000000"/>
-      <w:sz w:val="22"/>
+      <w:color w:val="4F81BD" w:themeColor="accent1"/>
+      <w:sz w:val="26"/>
       <w:szCs w:val="26"/>
     </w:rPr>
   </w:style>
@@ -2251,10 +927,7 @@
     <w:qFormat/>
     <w:rsid w:val="00FC693F"/>
     <w:pPr>
-      <w:pBdr>
-        <w:bottom w:val="single" w:sz="8" w:space="4" w:color="4F81BD" w:themeColor="accent1"/>
-      </w:pBdr>
-      <w:spacing w:after="200" w:line="240" w:lineRule="auto"/>
+      <w:spacing w:after="240" w:line="240" w:lineRule="auto"/>
       <w:contextualSpacing/>
     </w:pPr>
     <w:rPr>
@@ -2738,9 +1411,6 @@
     <w:qFormat/>
     <w:rsid w:val="00FC693F"/>
     <w:pPr>
-      <w:pBdr>
-        <w:bottom w:val="single" w:sz="4" w:space="4" w:color="4F81BD" w:themeColor="accent1"/>
-      </w:pBdr>
       <w:spacing w:before="200" w:after="280"/>
       <w:ind w:left="936" w:right="936"/>
     </w:pPr>

</xml_diff>